<commit_message>
sweeping changes to prof website plan & added optimised photos
</commit_message>
<xml_diff>
--- a/aglassofwineplease/Site Overview.docx
+++ b/aglassofwineplease/Site Overview.docx
@@ -4,301 +4,565 @@
   <w:body>
     <w:p>
       <w:pPr>
-        <w:jc w:val="center"/>
-        <w:rPr>
-          <w:rFonts w:ascii="Times New Roman" w:hAnsi="Times New Roman" w:cs="Times New Roman"/>
+        <w:spacing w:before="100" w:beforeAutospacing="1" w:after="100" w:afterAutospacing="1" w:line="240" w:lineRule="auto"/>
+        <w:rPr>
+          <w:rFonts w:ascii="Times New Roman" w:eastAsia="Times New Roman" w:hAnsi="Times New Roman" w:cs="Times New Roman"/>
           <w:sz w:val="24"/>
           <w:szCs w:val="24"/>
         </w:rPr>
       </w:pPr>
+      <w:r>
+        <w:rPr>
+          <w:rFonts w:ascii="Times New Roman" w:eastAsia="Times New Roman" w:hAnsi="Times New Roman" w:cs="Times New Roman"/>
+          <w:b/>
+          <w:bCs/>
+          <w:sz w:val="24"/>
+          <w:szCs w:val="24"/>
+        </w:rPr>
+        <w:t>PAGE 1 –</w:t>
+      </w:r>
+      <w:r>
+        <w:rPr>
+          <w:rFonts w:ascii="Times New Roman" w:eastAsia="Times New Roman" w:hAnsi="Times New Roman" w:cs="Times New Roman"/>
+          <w:b/>
+          <w:bCs/>
+          <w:sz w:val="24"/>
+          <w:szCs w:val="24"/>
+        </w:rPr>
+        <w:t xml:space="preserve"> Home</w:t>
+      </w:r>
     </w:p>
     <w:p>
       <w:pPr>
-        <w:jc w:val="center"/>
-        <w:rPr>
-          <w:rFonts w:ascii="Times New Roman" w:hAnsi="Times New Roman" w:cs="Times New Roman"/>
+        <w:pStyle w:val="ListParagraph"/>
+        <w:numPr>
+          <w:ilvl w:val="0"/>
+          <w:numId w:val="3"/>
+        </w:numPr>
+        <w:spacing w:before="100" w:beforeAutospacing="1" w:after="100" w:afterAutospacing="1" w:line="240" w:lineRule="auto"/>
+        <w:rPr>
+          <w:rFonts w:ascii="Times New Roman" w:eastAsia="Times New Roman" w:hAnsi="Times New Roman" w:cs="Times New Roman"/>
+          <w:sz w:val="20"/>
+          <w:szCs w:val="20"/>
+        </w:rPr>
+      </w:pPr>
+      <w:r>
+        <w:rPr>
+          <w:rFonts w:ascii="Times New Roman" w:eastAsia="Times New Roman" w:hAnsi="Times New Roman" w:cs="Times New Roman"/>
+          <w:sz w:val="20"/>
+          <w:szCs w:val="20"/>
+        </w:rPr>
+        <w:t>About</w:t>
+      </w:r>
+    </w:p>
+    <w:p>
+      <w:pPr>
+        <w:pStyle w:val="ListParagraph"/>
+        <w:numPr>
+          <w:ilvl w:val="0"/>
+          <w:numId w:val="3"/>
+        </w:numPr>
+        <w:spacing w:before="100" w:beforeAutospacing="1" w:after="100" w:afterAutospacing="1" w:line="240" w:lineRule="auto"/>
+        <w:rPr>
+          <w:rFonts w:ascii="Times New Roman" w:eastAsia="Times New Roman" w:hAnsi="Times New Roman" w:cs="Times New Roman"/>
+          <w:sz w:val="20"/>
+          <w:szCs w:val="20"/>
+        </w:rPr>
+      </w:pPr>
+      <w:r>
+        <w:rPr>
+          <w:rFonts w:ascii="Times New Roman" w:eastAsia="Times New Roman" w:hAnsi="Times New Roman" w:cs="Times New Roman"/>
+          <w:sz w:val="20"/>
+          <w:szCs w:val="20"/>
+        </w:rPr>
+        <w:t>Wine Basics</w:t>
+      </w:r>
+    </w:p>
+    <w:p>
+      <w:pPr>
+        <w:spacing w:before="100" w:beforeAutospacing="1" w:after="100" w:afterAutospacing="1" w:line="240" w:lineRule="auto"/>
+        <w:rPr>
+          <w:rFonts w:ascii="Times New Roman" w:eastAsia="Times New Roman" w:hAnsi="Times New Roman" w:cs="Times New Roman"/>
+          <w:b/>
+          <w:bCs/>
           <w:sz w:val="24"/>
           <w:szCs w:val="24"/>
         </w:rPr>
       </w:pPr>
+      <w:r>
+        <w:rPr>
+          <w:rFonts w:ascii="Times New Roman" w:eastAsia="Times New Roman" w:hAnsi="Times New Roman" w:cs="Times New Roman"/>
+          <w:b/>
+          <w:bCs/>
+          <w:sz w:val="24"/>
+          <w:szCs w:val="24"/>
+        </w:rPr>
+        <w:t xml:space="preserve">PAGE 2 – </w:t>
+      </w:r>
+      <w:r>
+        <w:rPr>
+          <w:rFonts w:ascii="Times New Roman" w:eastAsia="Times New Roman" w:hAnsi="Times New Roman" w:cs="Times New Roman"/>
+          <w:b/>
+          <w:bCs/>
+          <w:sz w:val="24"/>
+          <w:szCs w:val="24"/>
+        </w:rPr>
+        <w:t>Meet Your Sommeliers</w:t>
+      </w:r>
     </w:p>
     <w:p>
       <w:pPr>
-        <w:jc w:val="center"/>
-        <w:rPr>
-          <w:rFonts w:ascii="Times New Roman" w:hAnsi="Times New Roman" w:cs="Times New Roman"/>
+        <w:pStyle w:val="ListParagraph"/>
+        <w:numPr>
+          <w:ilvl w:val="0"/>
+          <w:numId w:val="3"/>
+        </w:numPr>
+        <w:spacing w:before="100" w:beforeAutospacing="1" w:after="100" w:afterAutospacing="1" w:line="240" w:lineRule="auto"/>
+        <w:rPr>
+          <w:rFonts w:ascii="Times New Roman" w:eastAsia="Times New Roman" w:hAnsi="Times New Roman" w:cs="Times New Roman"/>
+          <w:sz w:val="20"/>
+          <w:szCs w:val="20"/>
+        </w:rPr>
+      </w:pPr>
+      <w:r>
+        <w:rPr>
+          <w:rFonts w:ascii="Times New Roman" w:eastAsia="Times New Roman" w:hAnsi="Times New Roman" w:cs="Times New Roman"/>
+          <w:sz w:val="20"/>
+          <w:szCs w:val="20"/>
+        </w:rPr>
+        <w:t>Meet your s</w:t>
+      </w:r>
+      <w:r>
+        <w:rPr>
+          <w:rFonts w:ascii="Times New Roman" w:eastAsia="Times New Roman" w:hAnsi="Times New Roman" w:cs="Times New Roman"/>
+          <w:sz w:val="20"/>
+          <w:szCs w:val="20"/>
+        </w:rPr>
+        <w:t>ommeli</w:t>
+      </w:r>
+      <w:r>
+        <w:rPr>
+          <w:rFonts w:ascii="Times New Roman" w:eastAsia="Times New Roman" w:hAnsi="Times New Roman" w:cs="Times New Roman"/>
+          <w:sz w:val="20"/>
+          <w:szCs w:val="20"/>
+        </w:rPr>
+        <w:t>ers</w:t>
+      </w:r>
+    </w:p>
+    <w:p>
+      <w:pPr>
+        <w:pStyle w:val="ListParagraph"/>
+        <w:numPr>
+          <w:ilvl w:val="0"/>
+          <w:numId w:val="3"/>
+        </w:numPr>
+        <w:spacing w:before="100" w:beforeAutospacing="1" w:after="100" w:afterAutospacing="1" w:line="240" w:lineRule="auto"/>
+        <w:rPr>
+          <w:rFonts w:ascii="Times New Roman" w:eastAsia="Times New Roman" w:hAnsi="Times New Roman" w:cs="Times New Roman"/>
+          <w:sz w:val="20"/>
+          <w:szCs w:val="20"/>
+        </w:rPr>
+      </w:pPr>
+      <w:r>
+        <w:rPr>
+          <w:rFonts w:ascii="Times New Roman" w:eastAsia="Times New Roman" w:hAnsi="Times New Roman" w:cs="Times New Roman"/>
+          <w:sz w:val="20"/>
+          <w:szCs w:val="20"/>
+        </w:rPr>
+        <w:t>Rates</w:t>
+      </w:r>
+    </w:p>
+    <w:p>
+      <w:pPr>
+        <w:pStyle w:val="ListParagraph"/>
+        <w:numPr>
+          <w:ilvl w:val="0"/>
+          <w:numId w:val="3"/>
+        </w:numPr>
+        <w:spacing w:before="100" w:beforeAutospacing="1" w:after="100" w:afterAutospacing="1" w:line="240" w:lineRule="auto"/>
+        <w:rPr>
+          <w:rFonts w:ascii="Times New Roman" w:eastAsia="Times New Roman" w:hAnsi="Times New Roman" w:cs="Times New Roman"/>
+          <w:sz w:val="20"/>
+          <w:szCs w:val="20"/>
+        </w:rPr>
+      </w:pPr>
+      <w:r>
+        <w:rPr>
+          <w:rFonts w:ascii="Times New Roman" w:eastAsia="Times New Roman" w:hAnsi="Times New Roman" w:cs="Times New Roman"/>
+          <w:sz w:val="20"/>
+          <w:szCs w:val="20"/>
+        </w:rPr>
+        <w:t>Customer Reviews</w:t>
+      </w:r>
+    </w:p>
+    <w:p>
+      <w:pPr>
+        <w:spacing w:before="100" w:beforeAutospacing="1" w:after="100" w:afterAutospacing="1" w:line="240" w:lineRule="auto"/>
+        <w:rPr>
+          <w:rFonts w:ascii="Times New Roman" w:eastAsia="Times New Roman" w:hAnsi="Times New Roman" w:cs="Times New Roman"/>
+          <w:b/>
+          <w:bCs/>
           <w:sz w:val="24"/>
           <w:szCs w:val="24"/>
         </w:rPr>
       </w:pPr>
+      <w:r>
+        <w:rPr>
+          <w:rFonts w:ascii="Times New Roman" w:eastAsia="Times New Roman" w:hAnsi="Times New Roman" w:cs="Times New Roman"/>
+          <w:b/>
+          <w:bCs/>
+          <w:sz w:val="24"/>
+          <w:szCs w:val="24"/>
+        </w:rPr>
+        <w:t xml:space="preserve">PAGE 3 – </w:t>
+      </w:r>
+      <w:r>
+        <w:rPr>
+          <w:rFonts w:ascii="Times New Roman" w:eastAsia="Times New Roman" w:hAnsi="Times New Roman" w:cs="Times New Roman"/>
+          <w:b/>
+          <w:bCs/>
+          <w:sz w:val="24"/>
+          <w:szCs w:val="24"/>
+        </w:rPr>
+        <w:t>Christmas Cookies &amp; Wine Pairings</w:t>
+      </w:r>
     </w:p>
     <w:p>
       <w:pPr>
-        <w:jc w:val="center"/>
-        <w:rPr>
-          <w:rFonts w:ascii="Times New Roman" w:hAnsi="Times New Roman" w:cs="Times New Roman"/>
+        <w:pStyle w:val="ListParagraph"/>
+        <w:numPr>
+          <w:ilvl w:val="0"/>
+          <w:numId w:val="3"/>
+        </w:numPr>
+        <w:spacing w:before="100" w:beforeAutospacing="1" w:after="100" w:afterAutospacing="1" w:line="240" w:lineRule="auto"/>
+        <w:rPr>
+          <w:rFonts w:ascii="Times New Roman" w:eastAsia="Times New Roman" w:hAnsi="Times New Roman" w:cs="Times New Roman"/>
+          <w:sz w:val="20"/>
+          <w:szCs w:val="20"/>
+        </w:rPr>
+      </w:pPr>
+      <w:r>
+        <w:rPr>
+          <w:rFonts w:ascii="Times New Roman" w:eastAsia="Times New Roman" w:hAnsi="Times New Roman" w:cs="Times New Roman"/>
+          <w:sz w:val="20"/>
+          <w:szCs w:val="20"/>
+        </w:rPr>
+        <w:t>Overview</w:t>
+      </w:r>
+    </w:p>
+    <w:p>
+      <w:pPr>
+        <w:pStyle w:val="ListParagraph"/>
+        <w:numPr>
+          <w:ilvl w:val="0"/>
+          <w:numId w:val="3"/>
+        </w:numPr>
+        <w:spacing w:before="100" w:beforeAutospacing="1" w:after="100" w:afterAutospacing="1" w:line="240" w:lineRule="auto"/>
+        <w:rPr>
+          <w:rFonts w:ascii="Times New Roman" w:eastAsia="Times New Roman" w:hAnsi="Times New Roman" w:cs="Times New Roman"/>
+          <w:sz w:val="20"/>
+          <w:szCs w:val="20"/>
+        </w:rPr>
+      </w:pPr>
+      <w:r>
+        <w:rPr>
+          <w:rFonts w:ascii="Times New Roman" w:eastAsia="Times New Roman" w:hAnsi="Times New Roman" w:cs="Times New Roman"/>
+          <w:sz w:val="20"/>
+          <w:szCs w:val="20"/>
+        </w:rPr>
+        <w:t>Christmas Cookies &amp; Wine Pair</w:t>
+      </w:r>
+      <w:r>
+        <w:rPr>
+          <w:rFonts w:ascii="Times New Roman" w:eastAsia="Times New Roman" w:hAnsi="Times New Roman" w:cs="Times New Roman"/>
+          <w:sz w:val="20"/>
+          <w:szCs w:val="20"/>
+        </w:rPr>
+        <w:t>ings</w:t>
+      </w:r>
+    </w:p>
+    <w:p>
+      <w:pPr>
+        <w:spacing w:before="100" w:beforeAutospacing="1" w:after="100" w:afterAutospacing="1" w:line="240" w:lineRule="auto"/>
+        <w:rPr>
+          <w:rFonts w:ascii="Times New Roman" w:eastAsia="Times New Roman" w:hAnsi="Times New Roman" w:cs="Times New Roman"/>
+          <w:sz w:val="20"/>
+          <w:szCs w:val="20"/>
+        </w:rPr>
+      </w:pPr>
+    </w:p>
+    <w:p>
+      <w:pPr>
+        <w:spacing w:before="100" w:beforeAutospacing="1" w:after="100" w:afterAutospacing="1" w:line="240" w:lineRule="auto"/>
+        <w:rPr>
+          <w:rFonts w:ascii="Times New Roman" w:eastAsia="Times New Roman" w:hAnsi="Times New Roman" w:cs="Times New Roman"/>
+          <w:b/>
+          <w:bCs/>
           <w:sz w:val="24"/>
           <w:szCs w:val="24"/>
         </w:rPr>
       </w:pPr>
+      <w:r>
+        <w:rPr>
+          <w:rFonts w:ascii="Times New Roman" w:eastAsia="Times New Roman" w:hAnsi="Times New Roman" w:cs="Times New Roman"/>
+          <w:b/>
+          <w:bCs/>
+          <w:sz w:val="24"/>
+          <w:szCs w:val="24"/>
+        </w:rPr>
+        <w:t>PAGE 1</w:t>
+      </w:r>
     </w:p>
     <w:p>
       <w:pPr>
-        <w:jc w:val="center"/>
-        <w:rPr>
-          <w:rFonts w:ascii="Times New Roman" w:hAnsi="Times New Roman" w:cs="Times New Roman"/>
+        <w:spacing w:before="100" w:beforeAutospacing="1" w:after="100" w:afterAutospacing="1" w:line="240" w:lineRule="auto"/>
+        <w:rPr>
+          <w:rFonts w:ascii="Times New Roman" w:eastAsia="Times New Roman" w:hAnsi="Times New Roman" w:cs="Times New Roman"/>
+          <w:sz w:val="20"/>
+          <w:szCs w:val="20"/>
+        </w:rPr>
+      </w:pPr>
+      <w:r>
+        <w:rPr>
+          <w:rFonts w:ascii="Times New Roman" w:eastAsia="Times New Roman" w:hAnsi="Times New Roman" w:cs="Times New Roman"/>
+          <w:sz w:val="20"/>
+          <w:szCs w:val="20"/>
+        </w:rPr>
+        <w:tab/>
+      </w:r>
+      <w:r>
+        <w:rPr>
+          <w:rFonts w:ascii="Times New Roman" w:eastAsia="Times New Roman" w:hAnsi="Times New Roman" w:cs="Times New Roman"/>
+          <w:sz w:val="20"/>
+          <w:szCs w:val="20"/>
+        </w:rPr>
+        <w:t>O</w:t>
+      </w:r>
+      <w:r>
+        <w:rPr>
+          <w:rFonts w:ascii="Times New Roman" w:eastAsia="Times New Roman" w:hAnsi="Times New Roman" w:cs="Times New Roman"/>
+          <w:sz w:val="20"/>
+          <w:szCs w:val="20"/>
+        </w:rPr>
+        <w:t xml:space="preserve">n this page, the </w:t>
+      </w:r>
+      <w:r>
+        <w:rPr>
+          <w:rFonts w:ascii="Times New Roman" w:eastAsia="Times New Roman" w:hAnsi="Times New Roman" w:cs="Times New Roman"/>
+          <w:sz w:val="20"/>
+          <w:szCs w:val="20"/>
+        </w:rPr>
+        <w:t>user/customer</w:t>
+      </w:r>
+      <w:r>
+        <w:rPr>
+          <w:rFonts w:ascii="Times New Roman" w:eastAsia="Times New Roman" w:hAnsi="Times New Roman" w:cs="Times New Roman"/>
+          <w:sz w:val="20"/>
+          <w:szCs w:val="20"/>
+        </w:rPr>
+        <w:t xml:space="preserve"> will find an “</w:t>
+      </w:r>
+      <w:r>
+        <w:rPr>
+          <w:rFonts w:ascii="Times New Roman" w:eastAsia="Times New Roman" w:hAnsi="Times New Roman" w:cs="Times New Roman"/>
+          <w:sz w:val="20"/>
+          <w:szCs w:val="20"/>
+        </w:rPr>
+        <w:t>A</w:t>
+      </w:r>
+      <w:r>
+        <w:rPr>
+          <w:rFonts w:ascii="Times New Roman" w:eastAsia="Times New Roman" w:hAnsi="Times New Roman" w:cs="Times New Roman"/>
+          <w:sz w:val="20"/>
+          <w:szCs w:val="20"/>
+        </w:rPr>
+        <w:t>bout” section, which makes the purpose of the website clear, which is to help a beginner in wine navigate the basic terms of wine. That will help establish that the website is going to meet their needs. The next section will be the “</w:t>
+      </w:r>
+      <w:r>
+        <w:rPr>
+          <w:rFonts w:ascii="Times New Roman" w:eastAsia="Times New Roman" w:hAnsi="Times New Roman" w:cs="Times New Roman"/>
+          <w:sz w:val="20"/>
+          <w:szCs w:val="20"/>
+        </w:rPr>
+        <w:t>W</w:t>
+      </w:r>
+      <w:r>
+        <w:rPr>
+          <w:rFonts w:ascii="Times New Roman" w:eastAsia="Times New Roman" w:hAnsi="Times New Roman" w:cs="Times New Roman"/>
+          <w:sz w:val="20"/>
+          <w:szCs w:val="20"/>
+        </w:rPr>
+        <w:t xml:space="preserve">ine </w:t>
+      </w:r>
+      <w:r>
+        <w:rPr>
+          <w:rFonts w:ascii="Times New Roman" w:eastAsia="Times New Roman" w:hAnsi="Times New Roman" w:cs="Times New Roman"/>
+          <w:sz w:val="20"/>
+          <w:szCs w:val="20"/>
+        </w:rPr>
+        <w:t>B</w:t>
+      </w:r>
+      <w:r>
+        <w:rPr>
+          <w:rFonts w:ascii="Times New Roman" w:eastAsia="Times New Roman" w:hAnsi="Times New Roman" w:cs="Times New Roman"/>
+          <w:sz w:val="20"/>
+          <w:szCs w:val="20"/>
+        </w:rPr>
+        <w:t>asics” section, which will list the eight varieties of wine and their respective aspects that will be presented in a manner that is readable and understandable</w:t>
+      </w:r>
+      <w:r>
+        <w:rPr>
+          <w:rFonts w:ascii="Times New Roman" w:eastAsia="Times New Roman" w:hAnsi="Times New Roman" w:cs="Times New Roman"/>
+          <w:sz w:val="20"/>
+          <w:szCs w:val="20"/>
+        </w:rPr>
+        <w:t>.</w:t>
+      </w:r>
+    </w:p>
+    <w:p>
+      <w:pPr>
+        <w:spacing w:before="100" w:beforeAutospacing="1" w:after="100" w:afterAutospacing="1" w:line="240" w:lineRule="auto"/>
+        <w:rPr>
+          <w:rFonts w:ascii="Times New Roman" w:eastAsia="Times New Roman" w:hAnsi="Times New Roman" w:cs="Times New Roman"/>
+          <w:b/>
+          <w:bCs/>
           <w:sz w:val="24"/>
           <w:szCs w:val="24"/>
         </w:rPr>
       </w:pPr>
+      <w:r>
+        <w:rPr>
+          <w:rFonts w:ascii="Times New Roman" w:eastAsia="Times New Roman" w:hAnsi="Times New Roman" w:cs="Times New Roman"/>
+          <w:b/>
+          <w:bCs/>
+          <w:sz w:val="24"/>
+          <w:szCs w:val="24"/>
+        </w:rPr>
+        <w:t>PAGE 2</w:t>
+      </w:r>
     </w:p>
     <w:p>
       <w:pPr>
-        <w:jc w:val="center"/>
-        <w:rPr>
-          <w:rFonts w:ascii="Times New Roman" w:hAnsi="Times New Roman" w:cs="Times New Roman"/>
+        <w:spacing w:before="100" w:beforeAutospacing="1" w:after="100" w:afterAutospacing="1" w:line="240" w:lineRule="auto"/>
+        <w:rPr>
+          <w:rFonts w:ascii="Times New Roman" w:eastAsia="Times New Roman" w:hAnsi="Times New Roman" w:cs="Times New Roman"/>
+          <w:sz w:val="20"/>
+          <w:szCs w:val="20"/>
+        </w:rPr>
+      </w:pPr>
+      <w:r>
+        <w:rPr>
+          <w:rFonts w:ascii="Times New Roman" w:eastAsia="Times New Roman" w:hAnsi="Times New Roman" w:cs="Times New Roman"/>
+          <w:sz w:val="20"/>
+          <w:szCs w:val="20"/>
+        </w:rPr>
+        <w:tab/>
+        <w:t>On this page, the user</w:t>
+      </w:r>
+      <w:r>
+        <w:rPr>
+          <w:rFonts w:ascii="Times New Roman" w:eastAsia="Times New Roman" w:hAnsi="Times New Roman" w:cs="Times New Roman"/>
+          <w:sz w:val="20"/>
+          <w:szCs w:val="20"/>
+        </w:rPr>
+        <w:t xml:space="preserve">/customer </w:t>
+      </w:r>
+      <w:r>
+        <w:rPr>
+          <w:rFonts w:ascii="Times New Roman" w:eastAsia="Times New Roman" w:hAnsi="Times New Roman" w:cs="Times New Roman"/>
+          <w:sz w:val="20"/>
+          <w:szCs w:val="20"/>
+        </w:rPr>
+        <w:t>will find a “Meet Your Sommeliers” section, which shows a list of available sommeliers, or wine experts, that they could get in-touch with for more in-depth learning experiences. This section will be especially helpful for those who really want to learn different things such as regional differences in wines and soil types. The next section will be the “rates” section, which will display the prices of meeting with sommeliers via video call. The prices section will establish upfront what the customer has to pay to meet with the sommeliers, which will help customers gain trust for the website and not be skeptical of hidden costs. Lastly, the last section will be “customer reviews”, which will contain a list of favourable customer reviews of specifically the sommelier servicer that will make the customer even more interested in getting in-touch with an experienced sommelier.</w:t>
+      </w:r>
+    </w:p>
+    <w:p>
+      <w:pPr>
+        <w:spacing w:before="100" w:beforeAutospacing="1" w:after="100" w:afterAutospacing="1" w:line="240" w:lineRule="auto"/>
+        <w:rPr>
+          <w:rFonts w:ascii="Times New Roman" w:eastAsia="Times New Roman" w:hAnsi="Times New Roman" w:cs="Times New Roman"/>
+          <w:b/>
+          <w:bCs/>
           <w:sz w:val="24"/>
           <w:szCs w:val="24"/>
         </w:rPr>
       </w:pPr>
       <w:r>
         <w:rPr>
-          <w:rFonts w:ascii="Times New Roman" w:hAnsi="Times New Roman" w:cs="Times New Roman"/>
+          <w:rFonts w:ascii="Times New Roman" w:eastAsia="Times New Roman" w:hAnsi="Times New Roman" w:cs="Times New Roman"/>
+          <w:b/>
+          <w:bCs/>
           <w:sz w:val="24"/>
           <w:szCs w:val="24"/>
         </w:rPr>
-        <w:t>Personal Site Content Overview</w:t>
+        <w:t>PAGE 3</w:t>
       </w:r>
     </w:p>
     <w:p>
       <w:pPr>
-        <w:rPr>
-          <w:rFonts w:ascii="Times New Roman" w:hAnsi="Times New Roman" w:cs="Times New Roman"/>
-          <w:sz w:val="24"/>
-          <w:szCs w:val="24"/>
-        </w:rPr>
-      </w:pPr>
-    </w:p>
-    <w:p>
-      <w:pPr>
         <w:spacing w:before="100" w:beforeAutospacing="1" w:after="100" w:afterAutospacing="1" w:line="240" w:lineRule="auto"/>
-        <w:ind w:left="360"/>
-        <w:rPr>
-          <w:rFonts w:ascii="Times New Roman" w:eastAsia="Times New Roman" w:hAnsi="Times New Roman" w:cs="Times New Roman"/>
-          <w:sz w:val="24"/>
-          <w:szCs w:val="24"/>
-        </w:rPr>
-      </w:pPr>
-      <w:r>
-        <w:rPr>
-          <w:rFonts w:ascii="Times New Roman" w:eastAsia="Times New Roman" w:hAnsi="Times New Roman" w:cs="Times New Roman"/>
-          <w:sz w:val="24"/>
-          <w:szCs w:val="24"/>
-        </w:rPr>
-        <w:t>Why will people come to your site?</w:t>
-      </w:r>
-    </w:p>
-    <w:p>
-      <w:pPr>
-        <w:spacing w:before="100" w:beforeAutospacing="1" w:after="100" w:afterAutospacing="1" w:line="240" w:lineRule="auto"/>
-        <w:ind w:left="360"/>
-        <w:rPr>
-          <w:rFonts w:ascii="Times New Roman" w:eastAsia="Times New Roman" w:hAnsi="Times New Roman" w:cs="Times New Roman"/>
-          <w:sz w:val="24"/>
-          <w:szCs w:val="24"/>
-        </w:rPr>
-      </w:pPr>
-      <w:r>
-        <w:rPr>
-          <w:rFonts w:ascii="Times New Roman" w:eastAsia="Times New Roman" w:hAnsi="Times New Roman" w:cs="Times New Roman"/>
-          <w:sz w:val="24"/>
-          <w:szCs w:val="24"/>
-        </w:rPr>
-        <w:tab/>
-        <w:t>I assume that people will come to my site because they are wanting to dive into the world of wine and want a helpful guide to do so.</w:t>
-      </w:r>
-    </w:p>
-    <w:p>
-      <w:pPr>
-        <w:spacing w:before="100" w:beforeAutospacing="1" w:after="100" w:afterAutospacing="1" w:line="240" w:lineRule="auto"/>
-        <w:ind w:left="360"/>
-        <w:rPr>
-          <w:rFonts w:ascii="Times New Roman" w:eastAsia="Times New Roman" w:hAnsi="Times New Roman" w:cs="Times New Roman"/>
-          <w:sz w:val="24"/>
-          <w:szCs w:val="24"/>
-        </w:rPr>
-      </w:pPr>
-      <w:r>
-        <w:rPr>
-          <w:rFonts w:ascii="Times New Roman" w:eastAsia="Times New Roman" w:hAnsi="Times New Roman" w:cs="Times New Roman"/>
-          <w:sz w:val="24"/>
-          <w:szCs w:val="24"/>
-        </w:rPr>
-        <w:t>What questions will your visitors expect your site to answer for them?</w:t>
-      </w:r>
-    </w:p>
-    <w:p>
-      <w:pPr>
-        <w:spacing w:before="100" w:beforeAutospacing="1" w:after="100" w:afterAutospacing="1" w:line="240" w:lineRule="auto"/>
-        <w:ind w:left="360"/>
-        <w:rPr>
-          <w:rFonts w:ascii="Times New Roman" w:eastAsia="Times New Roman" w:hAnsi="Times New Roman" w:cs="Times New Roman"/>
-          <w:sz w:val="24"/>
-          <w:szCs w:val="24"/>
-        </w:rPr>
-      </w:pPr>
-      <w:r>
-        <w:rPr>
-          <w:rFonts w:ascii="Times New Roman" w:eastAsia="Times New Roman" w:hAnsi="Times New Roman" w:cs="Times New Roman"/>
-          <w:sz w:val="24"/>
-          <w:szCs w:val="24"/>
-        </w:rPr>
-        <w:tab/>
-        <w:t>Some questions my visitors might expect are, “what kinds of wine go good with certain foods?” “</w:t>
-      </w:r>
-    </w:p>
-    <w:p>
-      <w:pPr>
-        <w:spacing w:before="100" w:beforeAutospacing="1" w:after="100" w:afterAutospacing="1" w:line="240" w:lineRule="auto"/>
-        <w:ind w:left="360"/>
-        <w:rPr>
-          <w:rFonts w:ascii="Times New Roman" w:eastAsia="Times New Roman" w:hAnsi="Times New Roman" w:cs="Times New Roman"/>
-          <w:sz w:val="24"/>
-          <w:szCs w:val="24"/>
-        </w:rPr>
-      </w:pPr>
-      <w:r>
-        <w:rPr>
-          <w:rFonts w:ascii="Times New Roman" w:eastAsia="Times New Roman" w:hAnsi="Times New Roman" w:cs="Times New Roman"/>
-          <w:sz w:val="24"/>
-          <w:szCs w:val="24"/>
-        </w:rPr>
-        <w:t>What types of activities will visitors want to complete on your site?</w:t>
-      </w:r>
-    </w:p>
-    <w:p>
-      <w:pPr>
-        <w:spacing w:before="100" w:beforeAutospacing="1" w:after="100" w:afterAutospacing="1" w:line="240" w:lineRule="auto"/>
-        <w:ind w:left="360"/>
-        <w:rPr>
-          <w:rFonts w:ascii="Times New Roman" w:eastAsia="Times New Roman" w:hAnsi="Times New Roman" w:cs="Times New Roman"/>
-          <w:sz w:val="24"/>
-          <w:szCs w:val="24"/>
-        </w:rPr>
-      </w:pPr>
-      <w:r>
-        <w:rPr>
-          <w:rFonts w:ascii="Times New Roman" w:eastAsia="Times New Roman" w:hAnsi="Times New Roman" w:cs="Times New Roman"/>
-          <w:sz w:val="24"/>
-          <w:szCs w:val="24"/>
-        </w:rPr>
-        <w:tab/>
-        <w:t>They will want to connect with experienced sommeliers and learn how certain wines pair with Christmas cookies</w:t>
-      </w:r>
-    </w:p>
-    <w:p>
-      <w:pPr>
-        <w:spacing w:before="100" w:beforeAutospacing="1" w:after="100" w:afterAutospacing="1" w:line="240" w:lineRule="auto"/>
-        <w:ind w:left="360"/>
-        <w:rPr>
-          <w:rFonts w:ascii="Times New Roman" w:eastAsia="Times New Roman" w:hAnsi="Times New Roman" w:cs="Times New Roman"/>
-          <w:sz w:val="24"/>
-          <w:szCs w:val="24"/>
-        </w:rPr>
-      </w:pPr>
-      <w:r>
-        <w:rPr>
-          <w:rFonts w:ascii="Times New Roman" w:eastAsia="Times New Roman" w:hAnsi="Times New Roman" w:cs="Times New Roman"/>
-          <w:sz w:val="24"/>
-          <w:szCs w:val="24"/>
-        </w:rPr>
-        <w:t>What information is necessary to complete any actions your site offers?</w:t>
-      </w:r>
-    </w:p>
-    <w:p>
-      <w:pPr>
-        <w:spacing w:before="100" w:beforeAutospacing="1" w:after="100" w:afterAutospacing="1" w:line="240" w:lineRule="auto"/>
-        <w:ind w:left="360"/>
-        <w:rPr>
-          <w:rFonts w:ascii="Times New Roman" w:eastAsia="Times New Roman" w:hAnsi="Times New Roman" w:cs="Times New Roman"/>
-          <w:sz w:val="24"/>
-          <w:szCs w:val="24"/>
-        </w:rPr>
-      </w:pPr>
-      <w:r>
-        <w:rPr>
-          <w:rFonts w:ascii="Times New Roman" w:eastAsia="Times New Roman" w:hAnsi="Times New Roman" w:cs="Times New Roman"/>
-          <w:sz w:val="24"/>
-          <w:szCs w:val="24"/>
-        </w:rPr>
-        <w:tab/>
-        <w:t xml:space="preserve">The information </w:t>
-      </w:r>
-    </w:p>
-    <w:p>
-      <w:pPr>
-        <w:spacing w:before="100" w:beforeAutospacing="1" w:after="100" w:afterAutospacing="1" w:line="240" w:lineRule="auto"/>
-        <w:ind w:left="360"/>
-        <w:rPr>
-          <w:rFonts w:ascii="Times New Roman" w:eastAsia="Times New Roman" w:hAnsi="Times New Roman" w:cs="Times New Roman"/>
-          <w:sz w:val="24"/>
-          <w:szCs w:val="24"/>
-        </w:rPr>
-      </w:pPr>
-      <w:r>
-        <w:rPr>
-          <w:rFonts w:ascii="Times New Roman" w:eastAsia="Times New Roman" w:hAnsi="Times New Roman" w:cs="Times New Roman"/>
-          <w:sz w:val="24"/>
-          <w:szCs w:val="24"/>
-        </w:rPr>
-        <w:t>Why will your visitors come to your site instead of another to get this information or complete the actions</w:t>
-      </w:r>
-      <w:r>
-        <w:rPr>
-          <w:rFonts w:ascii="Times New Roman" w:eastAsia="Times New Roman" w:hAnsi="Times New Roman" w:cs="Times New Roman"/>
-          <w:sz w:val="24"/>
-          <w:szCs w:val="24"/>
-        </w:rPr>
-        <w:t>?</w:t>
-      </w:r>
-    </w:p>
-    <w:p>
-      <w:pPr>
-        <w:spacing w:before="100" w:beforeAutospacing="1" w:after="100" w:afterAutospacing="1" w:line="240" w:lineRule="auto"/>
-        <w:ind w:left="360"/>
-        <w:rPr>
-          <w:rFonts w:ascii="Times New Roman" w:eastAsia="Times New Roman" w:hAnsi="Times New Roman" w:cs="Times New Roman"/>
-          <w:sz w:val="24"/>
-          <w:szCs w:val="24"/>
-        </w:rPr>
-      </w:pPr>
-      <w:r>
-        <w:rPr>
-          <w:rFonts w:ascii="Times New Roman" w:eastAsia="Times New Roman" w:hAnsi="Times New Roman" w:cs="Times New Roman"/>
-          <w:sz w:val="24"/>
-          <w:szCs w:val="24"/>
-        </w:rPr>
-        <w:tab/>
-        <w:t>Because they will know that my website is the easiest to read.</w:t>
-      </w:r>
-    </w:p>
-    <w:p>
-      <w:pPr>
-        <w:spacing w:before="100" w:beforeAutospacing="1" w:after="100" w:afterAutospacing="1" w:line="240" w:lineRule="auto"/>
-        <w:ind w:left="360"/>
-        <w:rPr>
-          <w:rFonts w:ascii="Times New Roman" w:eastAsia="Times New Roman" w:hAnsi="Times New Roman" w:cs="Times New Roman"/>
-          <w:sz w:val="24"/>
-          <w:szCs w:val="24"/>
-        </w:rPr>
-      </w:pPr>
-      <w:r>
-        <w:rPr>
-          <w:rFonts w:ascii="Times New Roman" w:eastAsia="Times New Roman" w:hAnsi="Times New Roman" w:cs="Times New Roman"/>
-          <w:sz w:val="24"/>
-          <w:szCs w:val="24"/>
-        </w:rPr>
-        <w:tab/>
+        <w:ind w:firstLine="720"/>
+        <w:rPr>
+          <w:rFonts w:ascii="Times New Roman" w:eastAsia="Times New Roman" w:hAnsi="Times New Roman" w:cs="Times New Roman"/>
+          <w:sz w:val="20"/>
+          <w:szCs w:val="20"/>
+        </w:rPr>
+      </w:pPr>
+      <w:r>
+        <w:rPr>
+          <w:rFonts w:ascii="Times New Roman" w:eastAsia="Times New Roman" w:hAnsi="Times New Roman" w:cs="Times New Roman"/>
+          <w:sz w:val="20"/>
+          <w:szCs w:val="20"/>
+        </w:rPr>
+        <w:t>On this page, the user</w:t>
+      </w:r>
+      <w:r>
+        <w:rPr>
+          <w:rFonts w:ascii="Times New Roman" w:eastAsia="Times New Roman" w:hAnsi="Times New Roman" w:cs="Times New Roman"/>
+          <w:sz w:val="20"/>
+          <w:szCs w:val="20"/>
+        </w:rPr>
+        <w:t>/customer</w:t>
+      </w:r>
+      <w:r>
+        <w:rPr>
+          <w:rFonts w:ascii="Times New Roman" w:eastAsia="Times New Roman" w:hAnsi="Times New Roman" w:cs="Times New Roman"/>
+          <w:sz w:val="20"/>
+          <w:szCs w:val="20"/>
+        </w:rPr>
+        <w:t xml:space="preserve"> will find an “Overview” section, which will act as an introduction to the wonderful world of wine pairings during the festive seasons. This page is seasonal and is to change after the holiday season. The next section will be the actual information on </w:t>
+      </w:r>
+      <w:r>
+        <w:rPr>
+          <w:rFonts w:ascii="Times New Roman" w:eastAsia="Times New Roman" w:hAnsi="Times New Roman" w:cs="Times New Roman"/>
+          <w:sz w:val="20"/>
+          <w:szCs w:val="20"/>
+        </w:rPr>
+        <w:t xml:space="preserve">wines to pair with Christmas cookies, </w:t>
+      </w:r>
+      <w:r>
+        <w:rPr>
+          <w:rFonts w:ascii="Times New Roman" w:eastAsia="Times New Roman" w:hAnsi="Times New Roman" w:cs="Times New Roman"/>
+          <w:sz w:val="20"/>
+          <w:szCs w:val="20"/>
+        </w:rPr>
+        <w:t xml:space="preserve">that will be presented in a manner that is readable and </w:t>
+      </w:r>
+      <w:r>
+        <w:rPr>
+          <w:rFonts w:ascii="Times New Roman" w:eastAsia="Times New Roman" w:hAnsi="Times New Roman" w:cs="Times New Roman"/>
+          <w:sz w:val="20"/>
+          <w:szCs w:val="20"/>
+        </w:rPr>
+        <w:t>understandable. It w</w:t>
+      </w:r>
+      <w:r>
+        <w:rPr>
+          <w:rFonts w:ascii="Times New Roman" w:eastAsia="Times New Roman" w:hAnsi="Times New Roman" w:cs="Times New Roman"/>
+          <w:sz w:val="20"/>
+          <w:szCs w:val="20"/>
+        </w:rPr>
+        <w:t>ill help build-off of the information about wines from the first page.</w:t>
       </w:r>
     </w:p>
     <w:sectPr>
@@ -314,6 +578,232 @@
 <file path=word/numbering.xml><?xml version="1.0" encoding="utf-8"?>
 <w:numbering xmlns:wpc="http://schemas.microsoft.com/office/word/2010/wordprocessingCanvas" xmlns:cx="http://schemas.microsoft.com/office/drawing/2014/chartex" xmlns:cx1="http://schemas.microsoft.com/office/drawing/2015/9/8/chartex" xmlns:cx2="http://schemas.microsoft.com/office/drawing/2015/10/21/chartex" xmlns:cx3="http://schemas.microsoft.com/office/drawing/2016/5/9/chartex" xmlns:cx4="http://schemas.microsoft.com/office/drawing/2016/5/10/chartex" xmlns:cx5="http://schemas.microsoft.com/office/drawing/2016/5/11/chartex" xmlns:cx6="http://schemas.microsoft.com/office/drawing/2016/5/12/chartex" xmlns:cx7="http://schemas.microsoft.com/office/drawing/2016/5/13/chartex" xmlns:cx8="http://schemas.microsoft.com/office/drawing/2016/5/14/chartex" xmlns:mc="http://schemas.openxmlformats.org/markup-compatibility/2006" xmlns:aink="http://schemas.microsoft.com/office/drawing/2016/ink" xmlns:am3d="http://schemas.microsoft.com/office/drawing/2017/model3d" xmlns:o="urn:schemas-microsoft-com:office:office" xmlns:oel="http://schemas.microsoft.com/office/2019/extlst" xmlns:r="http://schemas.openxmlformats.org/officeDocument/2006/relationships" xmlns:m="http://schemas.openxmlformats.org/officeDocument/2006/math" xmlns:v="urn:schemas-microsoft-com:vml" xmlns:wp14="http://schemas.microsoft.com/office/word/2010/wordprocessingDrawing" xmlns:wp="http://schemas.openxmlformats.org/drawingml/2006/wordprocessingDrawing" xmlns:w10="urn:schemas-microsoft-com:office:word" xmlns:w="http://schemas.openxmlformats.org/wordprocessingml/2006/main" xmlns:w14="http://schemas.microsoft.com/office/word/2010/wordml" xmlns:w15="http://schemas.microsoft.com/office/word/2012/wordml" xmlns:w16cex="http://schemas.microsoft.com/office/word/2018/wordml/cex" xmlns:w16cid="http://schemas.microsoft.com/office/word/2016/wordml/cid" xmlns:w16="http://schemas.microsoft.com/office/word/2018/wordml" xmlns:w16sdtdh="http://schemas.microsoft.com/office/word/2020/wordml/sdtdatahash" xmlns:w16se="http://schemas.microsoft.com/office/word/2015/wordml/symex" xmlns:wpg="http://schemas.microsoft.com/office/word/2010/wordprocessingGroup" xmlns:wpi="http://schemas.microsoft.com/office/word/2010/wordprocessingInk" xmlns:wne="http://schemas.microsoft.com/office/word/2006/wordml" xmlns:wps="http://schemas.microsoft.com/office/word/2010/wordprocessingShape" mc:Ignorable="w14 w15 w16se w16cid w16 w16cex w16sdtdh wp14">
   <w:abstractNum w:abstractNumId="0" w15:restartNumberingAfterBreak="0">
+    <w:nsid w:val="1ED9273B"/>
+    <w:multiLevelType w:val="hybridMultilevel"/>
+    <w:tmpl w:val="E0EC3E12"/>
+    <w:lvl w:ilvl="0" w:tplc="04090001">
+      <w:start w:val="1"/>
+      <w:numFmt w:val="bullet"/>
+      <w:lvlText w:val=""/>
+      <w:lvlJc w:val="left"/>
+      <w:pPr>
+        <w:ind w:left="720" w:hanging="360"/>
+      </w:pPr>
+      <w:rPr>
+        <w:rFonts w:ascii="Symbol" w:hAnsi="Symbol" w:hint="default"/>
+      </w:rPr>
+    </w:lvl>
+    <w:lvl w:ilvl="1" w:tplc="04090003">
+      <w:start w:val="1"/>
+      <w:numFmt w:val="bullet"/>
+      <w:lvlText w:val="o"/>
+      <w:lvlJc w:val="left"/>
+      <w:pPr>
+        <w:ind w:left="1440" w:hanging="360"/>
+      </w:pPr>
+      <w:rPr>
+        <w:rFonts w:ascii="Courier New" w:hAnsi="Courier New" w:cs="Courier New" w:hint="default"/>
+      </w:rPr>
+    </w:lvl>
+    <w:lvl w:ilvl="2" w:tplc="04090005" w:tentative="1">
+      <w:start w:val="1"/>
+      <w:numFmt w:val="bullet"/>
+      <w:lvlText w:val=""/>
+      <w:lvlJc w:val="left"/>
+      <w:pPr>
+        <w:ind w:left="2160" w:hanging="360"/>
+      </w:pPr>
+      <w:rPr>
+        <w:rFonts w:ascii="Wingdings" w:hAnsi="Wingdings" w:hint="default"/>
+      </w:rPr>
+    </w:lvl>
+    <w:lvl w:ilvl="3" w:tplc="04090001" w:tentative="1">
+      <w:start w:val="1"/>
+      <w:numFmt w:val="bullet"/>
+      <w:lvlText w:val=""/>
+      <w:lvlJc w:val="left"/>
+      <w:pPr>
+        <w:ind w:left="2880" w:hanging="360"/>
+      </w:pPr>
+      <w:rPr>
+        <w:rFonts w:ascii="Symbol" w:hAnsi="Symbol" w:hint="default"/>
+      </w:rPr>
+    </w:lvl>
+    <w:lvl w:ilvl="4" w:tplc="04090003" w:tentative="1">
+      <w:start w:val="1"/>
+      <w:numFmt w:val="bullet"/>
+      <w:lvlText w:val="o"/>
+      <w:lvlJc w:val="left"/>
+      <w:pPr>
+        <w:ind w:left="3600" w:hanging="360"/>
+      </w:pPr>
+      <w:rPr>
+        <w:rFonts w:ascii="Courier New" w:hAnsi="Courier New" w:cs="Courier New" w:hint="default"/>
+      </w:rPr>
+    </w:lvl>
+    <w:lvl w:ilvl="5" w:tplc="04090005" w:tentative="1">
+      <w:start w:val="1"/>
+      <w:numFmt w:val="bullet"/>
+      <w:lvlText w:val=""/>
+      <w:lvlJc w:val="left"/>
+      <w:pPr>
+        <w:ind w:left="4320" w:hanging="360"/>
+      </w:pPr>
+      <w:rPr>
+        <w:rFonts w:ascii="Wingdings" w:hAnsi="Wingdings" w:hint="default"/>
+      </w:rPr>
+    </w:lvl>
+    <w:lvl w:ilvl="6" w:tplc="04090001" w:tentative="1">
+      <w:start w:val="1"/>
+      <w:numFmt w:val="bullet"/>
+      <w:lvlText w:val=""/>
+      <w:lvlJc w:val="left"/>
+      <w:pPr>
+        <w:ind w:left="5040" w:hanging="360"/>
+      </w:pPr>
+      <w:rPr>
+        <w:rFonts w:ascii="Symbol" w:hAnsi="Symbol" w:hint="default"/>
+      </w:rPr>
+    </w:lvl>
+    <w:lvl w:ilvl="7" w:tplc="04090003" w:tentative="1">
+      <w:start w:val="1"/>
+      <w:numFmt w:val="bullet"/>
+      <w:lvlText w:val="o"/>
+      <w:lvlJc w:val="left"/>
+      <w:pPr>
+        <w:ind w:left="5760" w:hanging="360"/>
+      </w:pPr>
+      <w:rPr>
+        <w:rFonts w:ascii="Courier New" w:hAnsi="Courier New" w:cs="Courier New" w:hint="default"/>
+      </w:rPr>
+    </w:lvl>
+    <w:lvl w:ilvl="8" w:tplc="04090005" w:tentative="1">
+      <w:start w:val="1"/>
+      <w:numFmt w:val="bullet"/>
+      <w:lvlText w:val=""/>
+      <w:lvlJc w:val="left"/>
+      <w:pPr>
+        <w:ind w:left="6480" w:hanging="360"/>
+      </w:pPr>
+      <w:rPr>
+        <w:rFonts w:ascii="Wingdings" w:hAnsi="Wingdings" w:hint="default"/>
+      </w:rPr>
+    </w:lvl>
+  </w:abstractNum>
+  <w:abstractNum w:abstractNumId="1" w15:restartNumberingAfterBreak="0">
+    <w:nsid w:val="300E4AEB"/>
+    <w:multiLevelType w:val="hybridMultilevel"/>
+    <w:tmpl w:val="29F87146"/>
+    <w:lvl w:ilvl="0" w:tplc="04090001">
+      <w:start w:val="1"/>
+      <w:numFmt w:val="bullet"/>
+      <w:lvlText w:val=""/>
+      <w:lvlJc w:val="left"/>
+      <w:pPr>
+        <w:ind w:left="720" w:hanging="360"/>
+      </w:pPr>
+      <w:rPr>
+        <w:rFonts w:ascii="Symbol" w:hAnsi="Symbol" w:hint="default"/>
+      </w:rPr>
+    </w:lvl>
+    <w:lvl w:ilvl="1" w:tplc="04090003" w:tentative="1">
+      <w:start w:val="1"/>
+      <w:numFmt w:val="bullet"/>
+      <w:lvlText w:val="o"/>
+      <w:lvlJc w:val="left"/>
+      <w:pPr>
+        <w:ind w:left="1440" w:hanging="360"/>
+      </w:pPr>
+      <w:rPr>
+        <w:rFonts w:ascii="Courier New" w:hAnsi="Courier New" w:cs="Courier New" w:hint="default"/>
+      </w:rPr>
+    </w:lvl>
+    <w:lvl w:ilvl="2" w:tplc="04090005" w:tentative="1">
+      <w:start w:val="1"/>
+      <w:numFmt w:val="bullet"/>
+      <w:lvlText w:val=""/>
+      <w:lvlJc w:val="left"/>
+      <w:pPr>
+        <w:ind w:left="2160" w:hanging="360"/>
+      </w:pPr>
+      <w:rPr>
+        <w:rFonts w:ascii="Wingdings" w:hAnsi="Wingdings" w:hint="default"/>
+      </w:rPr>
+    </w:lvl>
+    <w:lvl w:ilvl="3" w:tplc="04090001" w:tentative="1">
+      <w:start w:val="1"/>
+      <w:numFmt w:val="bullet"/>
+      <w:lvlText w:val=""/>
+      <w:lvlJc w:val="left"/>
+      <w:pPr>
+        <w:ind w:left="2880" w:hanging="360"/>
+      </w:pPr>
+      <w:rPr>
+        <w:rFonts w:ascii="Symbol" w:hAnsi="Symbol" w:hint="default"/>
+      </w:rPr>
+    </w:lvl>
+    <w:lvl w:ilvl="4" w:tplc="04090003" w:tentative="1">
+      <w:start w:val="1"/>
+      <w:numFmt w:val="bullet"/>
+      <w:lvlText w:val="o"/>
+      <w:lvlJc w:val="left"/>
+      <w:pPr>
+        <w:ind w:left="3600" w:hanging="360"/>
+      </w:pPr>
+      <w:rPr>
+        <w:rFonts w:ascii="Courier New" w:hAnsi="Courier New" w:cs="Courier New" w:hint="default"/>
+      </w:rPr>
+    </w:lvl>
+    <w:lvl w:ilvl="5" w:tplc="04090005" w:tentative="1">
+      <w:start w:val="1"/>
+      <w:numFmt w:val="bullet"/>
+      <w:lvlText w:val=""/>
+      <w:lvlJc w:val="left"/>
+      <w:pPr>
+        <w:ind w:left="4320" w:hanging="360"/>
+      </w:pPr>
+      <w:rPr>
+        <w:rFonts w:ascii="Wingdings" w:hAnsi="Wingdings" w:hint="default"/>
+      </w:rPr>
+    </w:lvl>
+    <w:lvl w:ilvl="6" w:tplc="04090001" w:tentative="1">
+      <w:start w:val="1"/>
+      <w:numFmt w:val="bullet"/>
+      <w:lvlText w:val=""/>
+      <w:lvlJc w:val="left"/>
+      <w:pPr>
+        <w:ind w:left="5040" w:hanging="360"/>
+      </w:pPr>
+      <w:rPr>
+        <w:rFonts w:ascii="Symbol" w:hAnsi="Symbol" w:hint="default"/>
+      </w:rPr>
+    </w:lvl>
+    <w:lvl w:ilvl="7" w:tplc="04090003" w:tentative="1">
+      <w:start w:val="1"/>
+      <w:numFmt w:val="bullet"/>
+      <w:lvlText w:val="o"/>
+      <w:lvlJc w:val="left"/>
+      <w:pPr>
+        <w:ind w:left="5760" w:hanging="360"/>
+      </w:pPr>
+      <w:rPr>
+        <w:rFonts w:ascii="Courier New" w:hAnsi="Courier New" w:cs="Courier New" w:hint="default"/>
+      </w:rPr>
+    </w:lvl>
+    <w:lvl w:ilvl="8" w:tplc="04090005" w:tentative="1">
+      <w:start w:val="1"/>
+      <w:numFmt w:val="bullet"/>
+      <w:lvlText w:val=""/>
+      <w:lvlJc w:val="left"/>
+      <w:pPr>
+        <w:ind w:left="6480" w:hanging="360"/>
+      </w:pPr>
+      <w:rPr>
+        <w:rFonts w:ascii="Wingdings" w:hAnsi="Wingdings" w:hint="default"/>
+      </w:rPr>
+    </w:lvl>
+  </w:abstractNum>
+  <w:abstractNum w:abstractNumId="2" w15:restartNumberingAfterBreak="0">
     <w:nsid w:val="63493148"/>
     <w:multiLevelType w:val="multilevel"/>
     <w:tmpl w:val="9802F460"/>
@@ -462,8 +952,130 @@
       </w:rPr>
     </w:lvl>
   </w:abstractNum>
+  <w:abstractNum w:abstractNumId="3" w15:restartNumberingAfterBreak="0">
+    <w:nsid w:val="6B2C5740"/>
+    <w:multiLevelType w:val="hybridMultilevel"/>
+    <w:tmpl w:val="E0861E26"/>
+    <w:lvl w:ilvl="0" w:tplc="04090001">
+      <w:start w:val="1"/>
+      <w:numFmt w:val="bullet"/>
+      <w:lvlText w:val=""/>
+      <w:lvlJc w:val="left"/>
+      <w:pPr>
+        <w:ind w:left="720" w:hanging="360"/>
+      </w:pPr>
+      <w:rPr>
+        <w:rFonts w:ascii="Symbol" w:hAnsi="Symbol" w:hint="default"/>
+      </w:rPr>
+    </w:lvl>
+    <w:lvl w:ilvl="1" w:tplc="04090003" w:tentative="1">
+      <w:start w:val="1"/>
+      <w:numFmt w:val="bullet"/>
+      <w:lvlText w:val="o"/>
+      <w:lvlJc w:val="left"/>
+      <w:pPr>
+        <w:ind w:left="1440" w:hanging="360"/>
+      </w:pPr>
+      <w:rPr>
+        <w:rFonts w:ascii="Courier New" w:hAnsi="Courier New" w:cs="Courier New" w:hint="default"/>
+      </w:rPr>
+    </w:lvl>
+    <w:lvl w:ilvl="2" w:tplc="04090005" w:tentative="1">
+      <w:start w:val="1"/>
+      <w:numFmt w:val="bullet"/>
+      <w:lvlText w:val=""/>
+      <w:lvlJc w:val="left"/>
+      <w:pPr>
+        <w:ind w:left="2160" w:hanging="360"/>
+      </w:pPr>
+      <w:rPr>
+        <w:rFonts w:ascii="Wingdings" w:hAnsi="Wingdings" w:hint="default"/>
+      </w:rPr>
+    </w:lvl>
+    <w:lvl w:ilvl="3" w:tplc="04090001" w:tentative="1">
+      <w:start w:val="1"/>
+      <w:numFmt w:val="bullet"/>
+      <w:lvlText w:val=""/>
+      <w:lvlJc w:val="left"/>
+      <w:pPr>
+        <w:ind w:left="2880" w:hanging="360"/>
+      </w:pPr>
+      <w:rPr>
+        <w:rFonts w:ascii="Symbol" w:hAnsi="Symbol" w:hint="default"/>
+      </w:rPr>
+    </w:lvl>
+    <w:lvl w:ilvl="4" w:tplc="04090003" w:tentative="1">
+      <w:start w:val="1"/>
+      <w:numFmt w:val="bullet"/>
+      <w:lvlText w:val="o"/>
+      <w:lvlJc w:val="left"/>
+      <w:pPr>
+        <w:ind w:left="3600" w:hanging="360"/>
+      </w:pPr>
+      <w:rPr>
+        <w:rFonts w:ascii="Courier New" w:hAnsi="Courier New" w:cs="Courier New" w:hint="default"/>
+      </w:rPr>
+    </w:lvl>
+    <w:lvl w:ilvl="5" w:tplc="04090005" w:tentative="1">
+      <w:start w:val="1"/>
+      <w:numFmt w:val="bullet"/>
+      <w:lvlText w:val=""/>
+      <w:lvlJc w:val="left"/>
+      <w:pPr>
+        <w:ind w:left="4320" w:hanging="360"/>
+      </w:pPr>
+      <w:rPr>
+        <w:rFonts w:ascii="Wingdings" w:hAnsi="Wingdings" w:hint="default"/>
+      </w:rPr>
+    </w:lvl>
+    <w:lvl w:ilvl="6" w:tplc="04090001" w:tentative="1">
+      <w:start w:val="1"/>
+      <w:numFmt w:val="bullet"/>
+      <w:lvlText w:val=""/>
+      <w:lvlJc w:val="left"/>
+      <w:pPr>
+        <w:ind w:left="5040" w:hanging="360"/>
+      </w:pPr>
+      <w:rPr>
+        <w:rFonts w:ascii="Symbol" w:hAnsi="Symbol" w:hint="default"/>
+      </w:rPr>
+    </w:lvl>
+    <w:lvl w:ilvl="7" w:tplc="04090003" w:tentative="1">
+      <w:start w:val="1"/>
+      <w:numFmt w:val="bullet"/>
+      <w:lvlText w:val="o"/>
+      <w:lvlJc w:val="left"/>
+      <w:pPr>
+        <w:ind w:left="5760" w:hanging="360"/>
+      </w:pPr>
+      <w:rPr>
+        <w:rFonts w:ascii="Courier New" w:hAnsi="Courier New" w:cs="Courier New" w:hint="default"/>
+      </w:rPr>
+    </w:lvl>
+    <w:lvl w:ilvl="8" w:tplc="04090005" w:tentative="1">
+      <w:start w:val="1"/>
+      <w:numFmt w:val="bullet"/>
+      <w:lvlText w:val=""/>
+      <w:lvlJc w:val="left"/>
+      <w:pPr>
+        <w:ind w:left="6480" w:hanging="360"/>
+      </w:pPr>
+      <w:rPr>
+        <w:rFonts w:ascii="Wingdings" w:hAnsi="Wingdings" w:hint="default"/>
+      </w:rPr>
+    </w:lvl>
+  </w:abstractNum>
   <w:num w:numId="1" w16cid:durableId="1674649230">
+    <w:abstractNumId w:val="2"/>
+  </w:num>
+  <w:num w:numId="2" w16cid:durableId="2104035705">
     <w:abstractNumId w:val="0"/>
+  </w:num>
+  <w:num w:numId="3" w16cid:durableId="1333607809">
+    <w:abstractNumId w:val="1"/>
+  </w:num>
+  <w:num w:numId="4" w16cid:durableId="1084109806">
+    <w:abstractNumId w:val="3"/>
   </w:num>
 </w:numbering>
 </file>
@@ -894,6 +1506,17 @@
     <w:semiHidden/>
     <w:unhideWhenUsed/>
   </w:style>
+  <w:style w:type="paragraph" w:styleId="ListParagraph">
+    <w:name w:val="List Paragraph"/>
+    <w:basedOn w:val="Normal"/>
+    <w:uiPriority w:val="34"/>
+    <w:qFormat/>
+    <w:rsid w:val="00FA53C4"/>
+    <w:pPr>
+      <w:ind w:left="720"/>
+      <w:contextualSpacing/>
+    </w:pPr>
+  </w:style>
 </w:styles>
 </file>
 

</xml_diff>